<commit_message>
feat: implement Navier-Stokes solver and update environment dependencies
</commit_message>
<xml_diff>
--- a/output/julia_hpc_setup_guide.docx
+++ b/output/julia_hpc_setup_guide.docx
@@ -79,7 +79,7 @@
           <w:color w:val="888888"/>
           <w:sz w:val="20"/>
         </w:rPr>
-        <w:t>Generated: 2026-05-03</w:t>
+        <w:t>Generated: 2026-05-04</w:t>
       </w:r>
     </w:p>
     <w:p>
@@ -109,7 +109,7 @@
           <w:i w:val="0"/>
           <w:sz w:val="22"/>
         </w:rPr>
-        <w:t>This guide walks you through setting up a complete Julia environment for scientific computing and HPC on Windows. Steps 1–3 install Julia. Step 4 introduces PDE packages. Step 5 walks the full PDE-solving workflow with worked examples for the heat, wave, Poisson, and Navier-Stokes equations and a section on unstructured meshing with Gmsh. Steps 6–8 connect to the HPC cluster.</w:t>
+        <w:t>This guide walks you through setting up a complete Julia environment for scientific computing and HPC on Windows. Steps 1–3 install Julia. Step 4 introduces PDE packages. Step 4.5 builds the juliaPDEs package — the same one shipped in the juliaPDEs/ folder of this repo — so you have a real module with Revise live-reload and a test suite before tackling the worked examples. Step 5 walks the full PDE-solving workflow with worked examples for the heat, wave, Poisson, and Navier-Stokes equations and a section on unstructured meshing with Gmsh. Steps 6–8 connect to the HPC cluster.</w:t>
       </w:r>
     </w:p>
     <w:p>
@@ -298,6 +298,38 @@
                 <w:sz w:val="20"/>
               </w:rPr>
               <w:t>15–20 min</w:t>
+            </w:r>
+          </w:p>
+        </w:tc>
+      </w:tr>
+      <w:tr>
+        <w:tc>
+          <w:tcPr>
+            <w:tcW w:type="dxa" w:w="4680"/>
+          </w:tcPr>
+          <w:p>
+            <w:r/>
+            <w:r>
+              <w:rPr>
+                <w:rFonts w:ascii="Arial" w:hAnsi="Arial"/>
+                <w:sz w:val="20"/>
+              </w:rPr>
+              <w:t>4.5 — Build juliaPDEs Package</w:t>
+            </w:r>
+          </w:p>
+        </w:tc>
+        <w:tc>
+          <w:tcPr>
+            <w:tcW w:type="dxa" w:w="4680"/>
+          </w:tcPr>
+          <w:p>
+            <w:r/>
+            <w:r>
+              <w:rPr>
+                <w:rFonts w:ascii="Arial" w:hAnsi="Arial"/>
+                <w:sz w:val="20"/>
+              </w:rPr>
+              <w:t>20–30 min</w:t>
             </w:r>
           </w:p>
         </w:tc>
@@ -489,7 +521,7 @@
                 <w:rFonts w:ascii="Arial" w:hAnsi="Arial"/>
                 <w:sz w:val="20"/>
               </w:rPr>
-              <w:t>~110–175 min</w:t>
+              <w:t>~130–205 min</w:t>
             </w:r>
           </w:p>
         </w:tc>
@@ -1490,6 +1522,2168 @@
           <w:color w:val="1F4E79"/>
           <w:sz w:val="36"/>
         </w:rPr>
+        <w:t>Step 4.5 — Build the juliaPDEs Package</w:t>
+      </w:r>
+    </w:p>
+    <w:p>
+      <w:r>
+        <w:rPr>
+          <w:rFonts w:ascii="Arial" w:hAnsi="Arial"/>
+          <w:b w:val="0"/>
+          <w:i w:val="0"/>
+          <w:sz w:val="22"/>
+        </w:rPr>
+        <w:t>Before tackling the worked examples in Step 5, package the code into a real Julia package called juliaPDEs. The same module — with src/heat.jl, src/wave.jl, and src/Navier_Stokes.jl — is what ships in the juliaPDEs/ folder of this repo. Working from a package gives you Revise live-reload, a test suite, and one stable import you can call from the REPL, from tests, and from Slurm job scripts.</w:t>
+      </w:r>
+    </w:p>
+    <w:p>
+      <w:pPr>
+        <w:pStyle w:val="Heading2"/>
+      </w:pPr>
+      <w:r>
+        <w:rPr>
+          <w:rFonts w:ascii="Arial" w:hAnsi="Arial"/>
+          <w:b/>
+          <w:color w:val="2E75B6"/>
+          <w:sz w:val="28"/>
+        </w:rPr>
+        <w:t>4.5.1  Step A — Generate the skeleton</w:t>
+      </w:r>
+    </w:p>
+    <w:p>
+      <w:r>
+        <w:rPr>
+          <w:rFonts w:ascii="Arial" w:hAnsi="Arial"/>
+          <w:b w:val="0"/>
+          <w:i w:val="0"/>
+          <w:sz w:val="22"/>
+        </w:rPr>
+        <w:t>One command creates the folder and the boilerplate Project.toml plus module file. Add a test/ folder yourself — Julia uses it automatically:</w:t>
+      </w:r>
+    </w:p>
+    <w:p>
+      <w:pPr>
+        <w:ind w:left="360"/>
+        <w:shd w:fill="F0F0F0"/>
+      </w:pPr>
+      <w:r>
+        <w:rPr>
+          <w:rFonts w:ascii="Courier New" w:hAnsi="Courier New"/>
+          <w:color w:val="1A1A1A"/>
+          <w:sz w:val="19"/>
+        </w:rPr>
+        <w:t>using Pkg</w:t>
+      </w:r>
+    </w:p>
+    <w:p>
+      <w:pPr>
+        <w:ind w:left="360"/>
+        <w:shd w:fill="F0F0F0"/>
+      </w:pPr>
+      <w:r>
+        <w:rPr>
+          <w:rFonts w:ascii="Courier New" w:hAnsi="Courier New"/>
+          <w:color w:val="1A1A1A"/>
+          <w:sz w:val="19"/>
+        </w:rPr>
+        <w:t>Pkg.generate("juliaPDEs")   # creates juliaPDEs/Project.toml + src/juliaPDEs.jl</w:t>
+      </w:r>
+    </w:p>
+    <w:p>
+      <w:pPr>
+        <w:ind w:left="360"/>
+        <w:shd w:fill="F0F0F0"/>
+      </w:pPr>
+      <w:r>
+        <w:rPr>
+          <w:rFonts w:ascii="Courier New" w:hAnsi="Courier New"/>
+          <w:color w:val="1A1A1A"/>
+          <w:sz w:val="19"/>
+        </w:rPr>
+        <w:t>mkdir juliaPDEs/test          # add a test/ folder yourself</w:t>
+      </w:r>
+    </w:p>
+    <w:p>
+      <w:pPr>
+        <w:ind w:left="360"/>
+        <w:shd w:fill="F0F0F0"/>
+      </w:pPr>
+      <w:r>
+        <w:rPr>
+          <w:rFonts w:ascii="Courier New" w:hAnsi="Courier New"/>
+          <w:color w:val="1A1A1A"/>
+          <w:sz w:val="19"/>
+        </w:rPr>
+        <w:t>touch juliaPDEs/test/runtests.jl</w:t>
+      </w:r>
+    </w:p>
+    <w:p>
+      <w:pPr>
+        <w:pStyle w:val="Heading2"/>
+      </w:pPr>
+      <w:r>
+        <w:rPr>
+          <w:rFonts w:ascii="Arial" w:hAnsi="Arial"/>
+          <w:b/>
+          <w:color w:val="2E75B6"/>
+          <w:sz w:val="28"/>
+        </w:rPr>
+        <w:t>4.5.2  Step B — Add the dependencies</w:t>
+      </w:r>
+    </w:p>
+    <w:p>
+      <w:r>
+        <w:rPr>
+          <w:rFonts w:ascii="Arial" w:hAnsi="Arial"/>
+          <w:b w:val="0"/>
+          <w:i w:val="0"/>
+          <w:sz w:val="22"/>
+        </w:rPr>
+        <w:t>Activate the new package's own environment and install everything the three solvers need. Plots is for visualization, Revise for live reload, and Oceananigans is the CFD engine called by the Navier-Stokes solver. The remaining packages match the Project.toml that ships with the repo:</w:t>
+      </w:r>
+    </w:p>
+    <w:p>
+      <w:pPr>
+        <w:ind w:left="360"/>
+        <w:shd w:fill="F0F0F0"/>
+      </w:pPr>
+      <w:r>
+        <w:rPr>
+          <w:rFonts w:ascii="Courier New" w:hAnsi="Courier New"/>
+          <w:color w:val="1A1A1A"/>
+          <w:sz w:val="19"/>
+        </w:rPr>
+        <w:t>cd juliaPDEs</w:t>
+      </w:r>
+    </w:p>
+    <w:p>
+      <w:pPr>
+        <w:ind w:left="360"/>
+        <w:shd w:fill="F0F0F0"/>
+      </w:pPr>
+      <w:r>
+        <w:rPr>
+          <w:rFonts w:ascii="Courier New" w:hAnsi="Courier New"/>
+          <w:color w:val="1A1A1A"/>
+          <w:sz w:val="19"/>
+        </w:rPr>
+        <w:t>julia --project=.</w:t>
+      </w:r>
+    </w:p>
+    <w:p>
+      <w:pPr>
+        <w:ind w:left="360"/>
+        <w:shd w:fill="F0F0F0"/>
+      </w:pPr>
+      <w:r>
+        <w:rPr>
+          <w:rFonts w:ascii="Courier New" w:hAnsi="Courier New"/>
+          <w:color w:val="1A1A1A"/>
+          <w:sz w:val="19"/>
+        </w:rPr>
+        <w:t># In package mode (press ]):</w:t>
+      </w:r>
+    </w:p>
+    <w:p>
+      <w:pPr>
+        <w:ind w:left="360"/>
+        <w:shd w:fill="F0F0F0"/>
+      </w:pPr>
+      <w:r>
+        <w:rPr>
+          <w:rFonts w:ascii="Courier New" w:hAnsi="Courier New"/>
+          <w:color w:val="1A1A1A"/>
+          <w:sz w:val="19"/>
+        </w:rPr>
+        <w:t>(@juliaPDEs) pkg&gt; add Plots Revise Oceananigans LinearAlgebra SparseArrays Gmsh Makie CUDA</w:t>
+      </w:r>
+    </w:p>
+    <w:p>
+      <w:r>
+        <w:rPr>
+          <w:rFonts w:ascii="Arial" w:hAnsi="Arial"/>
+          <w:b w:val="0"/>
+          <w:i w:val="0"/>
+          <w:sz w:val="22"/>
+        </w:rPr>
+        <w:t>Julia writes the deps into Project.toml and pins exact versions in Manifest.toml — commit both to git so the cluster gets the same versions you developed against.</w:t>
+      </w:r>
+    </w:p>
+    <w:p>
+      <w:pPr>
+        <w:pStyle w:val="Heading2"/>
+      </w:pPr>
+      <w:r>
+        <w:rPr>
+          <w:rFonts w:ascii="Arial" w:hAnsi="Arial"/>
+          <w:b/>
+          <w:color w:val="2E75B6"/>
+          <w:sz w:val="28"/>
+        </w:rPr>
+        <w:t>4.5.3  Step C — The module entry point: src/juliaPDEs.jl</w:t>
+      </w:r>
+    </w:p>
+    <w:p>
+      <w:r>
+        <w:rPr>
+          <w:rFonts w:ascii="Arial" w:hAnsi="Arial"/>
+          <w:b w:val="0"/>
+          <w:i w:val="0"/>
+          <w:sz w:val="22"/>
+        </w:rPr>
+        <w:t>Everything inside `module … end` is private by default. `using` brings third-party packages into the module once. `include()` pastes a sub-file in so it sees the module's scope. `export` declares the names visible after `using juliaPDEs`:</w:t>
+      </w:r>
+    </w:p>
+    <w:p>
+      <w:pPr>
+        <w:ind w:left="360"/>
+        <w:shd w:fill="F0F0F0"/>
+      </w:pPr>
+      <w:r>
+        <w:rPr>
+          <w:rFonts w:ascii="Courier New" w:hAnsi="Courier New"/>
+          <w:color w:val="1A1A1A"/>
+          <w:sz w:val="19"/>
+        </w:rPr>
+        <w:t>module juliaPDEs</w:t>
+      </w:r>
+    </w:p>
+    <w:p>
+      <w:pPr>
+        <w:ind w:left="360"/>
+        <w:shd w:fill="F0F0F0"/>
+      </w:pPr>
+      <w:r>
+        <w:rPr>
+          <w:rFonts w:ascii="Courier New" w:hAnsi="Courier New"/>
+          <w:color w:val="1A1A1A"/>
+          <w:sz w:val="19"/>
+        </w:rPr>
+      </w:r>
+    </w:p>
+    <w:p>
+      <w:pPr>
+        <w:ind w:left="360"/>
+        <w:shd w:fill="F0F0F0"/>
+      </w:pPr>
+      <w:r>
+        <w:rPr>
+          <w:rFonts w:ascii="Courier New" w:hAnsi="Courier New"/>
+          <w:color w:val="1A1A1A"/>
+          <w:sz w:val="19"/>
+        </w:rPr>
+        <w:t>using Plots, Revise, Oceananigans</w:t>
+      </w:r>
+    </w:p>
+    <w:p>
+      <w:pPr>
+        <w:ind w:left="360"/>
+        <w:shd w:fill="F0F0F0"/>
+      </w:pPr>
+      <w:r>
+        <w:rPr>
+          <w:rFonts w:ascii="Courier New" w:hAnsi="Courier New"/>
+          <w:color w:val="1A1A1A"/>
+          <w:sz w:val="19"/>
+        </w:rPr>
+      </w:r>
+    </w:p>
+    <w:p>
+      <w:pPr>
+        <w:ind w:left="360"/>
+        <w:shd w:fill="F0F0F0"/>
+      </w:pPr>
+      <w:r>
+        <w:rPr>
+          <w:rFonts w:ascii="Courier New" w:hAnsi="Courier New"/>
+          <w:color w:val="1A1A1A"/>
+          <w:sz w:val="19"/>
+        </w:rPr>
+        <w:t>include("heat.jl")</w:t>
+      </w:r>
+    </w:p>
+    <w:p>
+      <w:pPr>
+        <w:ind w:left="360"/>
+        <w:shd w:fill="F0F0F0"/>
+      </w:pPr>
+      <w:r>
+        <w:rPr>
+          <w:rFonts w:ascii="Courier New" w:hAnsi="Courier New"/>
+          <w:color w:val="1A1A1A"/>
+          <w:sz w:val="19"/>
+        </w:rPr>
+        <w:t>include("wave.jl")</w:t>
+      </w:r>
+    </w:p>
+    <w:p>
+      <w:pPr>
+        <w:ind w:left="360"/>
+        <w:shd w:fill="F0F0F0"/>
+      </w:pPr>
+      <w:r>
+        <w:rPr>
+          <w:rFonts w:ascii="Courier New" w:hAnsi="Courier New"/>
+          <w:color w:val="1A1A1A"/>
+          <w:sz w:val="19"/>
+        </w:rPr>
+        <w:t>include("Navier_Stokes.jl")</w:t>
+      </w:r>
+    </w:p>
+    <w:p>
+      <w:pPr>
+        <w:ind w:left="360"/>
+        <w:shd w:fill="F0F0F0"/>
+      </w:pPr>
+      <w:r>
+        <w:rPr>
+          <w:rFonts w:ascii="Courier New" w:hAnsi="Courier New"/>
+          <w:color w:val="1A1A1A"/>
+          <w:sz w:val="19"/>
+        </w:rPr>
+      </w:r>
+    </w:p>
+    <w:p>
+      <w:pPr>
+        <w:ind w:left="360"/>
+        <w:shd w:fill="F0F0F0"/>
+      </w:pPr>
+      <w:r>
+        <w:rPr>
+          <w:rFonts w:ascii="Courier New" w:hAnsi="Courier New"/>
+          <w:color w:val="1A1A1A"/>
+          <w:sz w:val="19"/>
+        </w:rPr>
+        <w:t>export solve_heat_1d, solve_wave_1d, solve_navier_stokes,</w:t>
+      </w:r>
+    </w:p>
+    <w:p>
+      <w:pPr>
+        <w:ind w:left="360"/>
+        <w:shd w:fill="F0F0F0"/>
+      </w:pPr>
+      <w:r>
+        <w:rPr>
+          <w:rFonts w:ascii="Courier New" w:hAnsi="Courier New"/>
+          <w:color w:val="1A1A1A"/>
+          <w:sz w:val="19"/>
+        </w:rPr>
+        <w:t xml:space="preserve">       animate_wave_1d, animate_navier_stokes</w:t>
+      </w:r>
+    </w:p>
+    <w:p>
+      <w:pPr>
+        <w:ind w:left="360"/>
+        <w:shd w:fill="F0F0F0"/>
+      </w:pPr>
+      <w:r>
+        <w:rPr>
+          <w:rFonts w:ascii="Courier New" w:hAnsi="Courier New"/>
+          <w:color w:val="1A1A1A"/>
+          <w:sz w:val="19"/>
+        </w:rPr>
+      </w:r>
+    </w:p>
+    <w:p>
+      <w:pPr>
+        <w:ind w:left="360"/>
+        <w:shd w:fill="F0F0F0"/>
+      </w:pPr>
+      <w:r>
+        <w:rPr>
+          <w:rFonts w:ascii="Courier New" w:hAnsi="Courier New"/>
+          <w:color w:val="1A1A1A"/>
+          <w:sz w:val="19"/>
+        </w:rPr>
+        <w:t>end # module juliaPDEs</w:t>
+      </w:r>
+    </w:p>
+    <w:p>
+      <w:r>
+        <w:br w:type="page"/>
+      </w:r>
+    </w:p>
+    <w:p>
+      <w:pPr>
+        <w:pStyle w:val="Heading2"/>
+      </w:pPr>
+      <w:r>
+        <w:rPr>
+          <w:rFonts w:ascii="Arial" w:hAnsi="Arial"/>
+          <w:b/>
+          <w:color w:val="2E75B6"/>
+          <w:sz w:val="28"/>
+        </w:rPr>
+        <w:t>4.5.4  Step D — The heat solver: src/heat.jl</w:t>
+      </w:r>
+    </w:p>
+    <w:p>
+      <w:r>
+        <w:rPr>
+          <w:rFonts w:ascii="Arial" w:hAnsi="Arial"/>
+          <w:b w:val="0"/>
+          <w:i w:val="0"/>
+          <w:sz w:val="22"/>
+        </w:rPr>
+        <w:t>A 1-D explicit Euler heat solver: Dirichlet BCs (the endpoints stay 0), Gaussian initial pulse. The CFL factor 0.4 keeps r = α·dt/dx² ≤ 0.5 so the explicit scheme is stable.</w:t>
+      </w:r>
+    </w:p>
+    <w:p>
+      <w:pPr>
+        <w:ind w:left="360"/>
+        <w:shd w:fill="F0F0F0"/>
+      </w:pPr>
+      <w:r>
+        <w:rPr>
+          <w:rFonts w:ascii="Courier New" w:hAnsi="Courier New"/>
+          <w:color w:val="1A1A1A"/>
+          <w:sz w:val="19"/>
+        </w:rPr>
+        <w:t>function solve_heat_1d(; N=200, α=0.01, L=1.0, T=1.0)</w:t>
+      </w:r>
+    </w:p>
+    <w:p>
+      <w:pPr>
+        <w:ind w:left="360"/>
+        <w:shd w:fill="F0F0F0"/>
+      </w:pPr>
+      <w:r>
+        <w:rPr>
+          <w:rFonts w:ascii="Courier New" w:hAnsi="Courier New"/>
+          <w:color w:val="1A1A1A"/>
+          <w:sz w:val="19"/>
+        </w:rPr>
+        <w:t xml:space="preserve">    dx     = L / (N + 1)</w:t>
+      </w:r>
+    </w:p>
+    <w:p>
+      <w:pPr>
+        <w:ind w:left="360"/>
+        <w:shd w:fill="F0F0F0"/>
+      </w:pPr>
+      <w:r>
+        <w:rPr>
+          <w:rFonts w:ascii="Courier New" w:hAnsi="Courier New"/>
+          <w:color w:val="1A1A1A"/>
+          <w:sz w:val="19"/>
+        </w:rPr>
+        <w:t xml:space="preserve">    x      = range(dx, L - dx, length=N)</w:t>
+      </w:r>
+    </w:p>
+    <w:p>
+      <w:pPr>
+        <w:ind w:left="360"/>
+        <w:shd w:fill="F0F0F0"/>
+      </w:pPr>
+      <w:r>
+        <w:rPr>
+          <w:rFonts w:ascii="Courier New" w:hAnsi="Courier New"/>
+          <w:color w:val="1A1A1A"/>
+          <w:sz w:val="19"/>
+        </w:rPr>
+        <w:t xml:space="preserve">    dt     = 0.4 * dx^2 / α          # CFL: r ≤ 0.5</w:t>
+      </w:r>
+    </w:p>
+    <w:p>
+      <w:pPr>
+        <w:ind w:left="360"/>
+        <w:shd w:fill="F0F0F0"/>
+      </w:pPr>
+      <w:r>
+        <w:rPr>
+          <w:rFonts w:ascii="Courier New" w:hAnsi="Courier New"/>
+          <w:color w:val="1A1A1A"/>
+          <w:sz w:val="19"/>
+        </w:rPr>
+        <w:t xml:space="preserve">    nsteps = ceil(Int, T / dt)</w:t>
+      </w:r>
+    </w:p>
+    <w:p>
+      <w:pPr>
+        <w:ind w:left="360"/>
+        <w:shd w:fill="F0F0F0"/>
+      </w:pPr>
+      <w:r>
+        <w:rPr>
+          <w:rFonts w:ascii="Courier New" w:hAnsi="Courier New"/>
+          <w:color w:val="1A1A1A"/>
+          <w:sz w:val="19"/>
+        </w:rPr>
+        <w:t xml:space="preserve">    u = @. exp(-100 * (x - 0.5)^2)   # Gaussian initial condition</w:t>
+      </w:r>
+    </w:p>
+    <w:p>
+      <w:pPr>
+        <w:ind w:left="360"/>
+        <w:shd w:fill="F0F0F0"/>
+      </w:pPr>
+      <w:r>
+        <w:rPr>
+          <w:rFonts w:ascii="Courier New" w:hAnsi="Courier New"/>
+          <w:color w:val="1A1A1A"/>
+          <w:sz w:val="19"/>
+        </w:rPr>
+        <w:t xml:space="preserve">    for _ in 1:nsteps</w:t>
+      </w:r>
+    </w:p>
+    <w:p>
+      <w:pPr>
+        <w:ind w:left="360"/>
+        <w:shd w:fill="F0F0F0"/>
+      </w:pPr>
+      <w:r>
+        <w:rPr>
+          <w:rFonts w:ascii="Courier New" w:hAnsi="Courier New"/>
+          <w:color w:val="1A1A1A"/>
+          <w:sz w:val="19"/>
+        </w:rPr>
+        <w:t xml:space="preserve">        # Explicit Euler + 3-point stencil:</w:t>
+      </w:r>
+    </w:p>
+    <w:p>
+      <w:pPr>
+        <w:ind w:left="360"/>
+        <w:shd w:fill="F0F0F0"/>
+      </w:pPr>
+      <w:r>
+        <w:rPr>
+          <w:rFonts w:ascii="Courier New" w:hAnsi="Courier New"/>
+          <w:color w:val="1A1A1A"/>
+          <w:sz w:val="19"/>
+        </w:rPr>
+        <w:t xml:space="preserve">        #   u_i^{n+1} = u_i^n + r·(u_{i+1} - 2u_i + u_{i-1})</w:t>
+      </w:r>
+    </w:p>
+    <w:p>
+      <w:pPr>
+        <w:ind w:left="360"/>
+        <w:shd w:fill="F0F0F0"/>
+      </w:pPr>
+      <w:r>
+        <w:rPr>
+          <w:rFonts w:ascii="Courier New" w:hAnsi="Courier New"/>
+          <w:color w:val="1A1A1A"/>
+          <w:sz w:val="19"/>
+        </w:rPr>
+        <w:t xml:space="preserve">        u[2:end-1] .+= (α * dt / dx^2) .*</w:t>
+      </w:r>
+    </w:p>
+    <w:p>
+      <w:pPr>
+        <w:ind w:left="360"/>
+        <w:shd w:fill="F0F0F0"/>
+      </w:pPr>
+      <w:r>
+        <w:rPr>
+          <w:rFonts w:ascii="Courier New" w:hAnsi="Courier New"/>
+          <w:color w:val="1A1A1A"/>
+          <w:sz w:val="19"/>
+        </w:rPr>
+        <w:t xml:space="preserve">            (u[3:end] .- 2 .* u[2:end-1] .+ u[1:end-2])</w:t>
+      </w:r>
+    </w:p>
+    <w:p>
+      <w:pPr>
+        <w:ind w:left="360"/>
+        <w:shd w:fill="F0F0F0"/>
+      </w:pPr>
+      <w:r>
+        <w:rPr>
+          <w:rFonts w:ascii="Courier New" w:hAnsi="Courier New"/>
+          <w:color w:val="1A1A1A"/>
+          <w:sz w:val="19"/>
+        </w:rPr>
+        <w:t xml:space="preserve">        # Dirichlet BCs: u[1] = u[end] = 0 — never updated</w:t>
+      </w:r>
+    </w:p>
+    <w:p>
+      <w:pPr>
+        <w:ind w:left="360"/>
+        <w:shd w:fill="F0F0F0"/>
+      </w:pPr>
+      <w:r>
+        <w:rPr>
+          <w:rFonts w:ascii="Courier New" w:hAnsi="Courier New"/>
+          <w:color w:val="1A1A1A"/>
+          <w:sz w:val="19"/>
+        </w:rPr>
+        <w:t xml:space="preserve">    end</w:t>
+      </w:r>
+    </w:p>
+    <w:p>
+      <w:pPr>
+        <w:ind w:left="360"/>
+        <w:shd w:fill="F0F0F0"/>
+      </w:pPr>
+      <w:r>
+        <w:rPr>
+          <w:rFonts w:ascii="Courier New" w:hAnsi="Courier New"/>
+          <w:color w:val="1A1A1A"/>
+          <w:sz w:val="19"/>
+        </w:rPr>
+        <w:t xml:space="preserve">    return collect(x), u</w:t>
+      </w:r>
+    </w:p>
+    <w:p>
+      <w:pPr>
+        <w:ind w:left="360"/>
+        <w:shd w:fill="F0F0F0"/>
+      </w:pPr>
+      <w:r>
+        <w:rPr>
+          <w:rFonts w:ascii="Courier New" w:hAnsi="Courier New"/>
+          <w:color w:val="1A1A1A"/>
+          <w:sz w:val="19"/>
+        </w:rPr>
+        <w:t>end</w:t>
+      </w:r>
+    </w:p>
+    <w:p>
+      <w:r>
+        <w:br w:type="page"/>
+      </w:r>
+    </w:p>
+    <w:p>
+      <w:pPr>
+        <w:pStyle w:val="Heading2"/>
+      </w:pPr>
+      <w:r>
+        <w:rPr>
+          <w:rFonts w:ascii="Arial" w:hAnsi="Arial"/>
+          <w:b/>
+          <w:color w:val="2E75B6"/>
+          <w:sz w:val="28"/>
+        </w:rPr>
+        <w:t>4.5.5  Step E — The wave solver: src/wave.jl</w:t>
+      </w:r>
+    </w:p>
+    <w:p>
+      <w:r>
+        <w:rPr>
+          <w:rFonts w:ascii="Arial" w:hAnsi="Arial"/>
+          <w:b w:val="0"/>
+          <w:i w:val="0"/>
+          <w:sz w:val="22"/>
+        </w:rPr>
+        <w:t>The wave solver groups its parameters in a WaveEquation struct so callers can mix-and-match grid size, boundary condition (:Dirichlet, :Neumann, :Periodic, :Absorbing), and initial shape independently. Base.@kwdef auto-generates a keyword constructor with defaults, so WaveEquation(nx=400, T=2.0) leaves everything else default:</w:t>
+      </w:r>
+    </w:p>
+    <w:p>
+      <w:pPr>
+        <w:ind w:left="360"/>
+        <w:shd w:fill="F0F0F0"/>
+      </w:pPr>
+      <w:r>
+        <w:rPr>
+          <w:rFonts w:ascii="Courier New" w:hAnsi="Courier New"/>
+          <w:color w:val="1A1A1A"/>
+          <w:sz w:val="19"/>
+        </w:rPr>
+        <w:t>Base.@kwdef struct WaveEquation</w:t>
+      </w:r>
+    </w:p>
+    <w:p>
+      <w:pPr>
+        <w:ind w:left="360"/>
+        <w:shd w:fill="F0F0F0"/>
+      </w:pPr>
+      <w:r>
+        <w:rPr>
+          <w:rFonts w:ascii="Courier New" w:hAnsi="Courier New"/>
+          <w:color w:val="1A1A1A"/>
+          <w:sz w:val="19"/>
+        </w:rPr>
+        <w:t xml:space="preserve">    nx::Int = 300</w:t>
+      </w:r>
+    </w:p>
+    <w:p>
+      <w:pPr>
+        <w:ind w:left="360"/>
+        <w:shd w:fill="F0F0F0"/>
+      </w:pPr>
+      <w:r>
+        <w:rPr>
+          <w:rFonts w:ascii="Courier New" w:hAnsi="Courier New"/>
+          <w:color w:val="1A1A1A"/>
+          <w:sz w:val="19"/>
+        </w:rPr>
+        <w:t xml:space="preserve">    nt::Int = 300</w:t>
+      </w:r>
+    </w:p>
+    <w:p>
+      <w:pPr>
+        <w:ind w:left="360"/>
+        <w:shd w:fill="F0F0F0"/>
+      </w:pPr>
+      <w:r>
+        <w:rPr>
+          <w:rFonts w:ascii="Courier New" w:hAnsi="Courier New"/>
+          <w:color w:val="1A1A1A"/>
+          <w:sz w:val="19"/>
+        </w:rPr>
+        <w:t xml:space="preserve">    c::Float64 = 1.0</w:t>
+      </w:r>
+    </w:p>
+    <w:p>
+      <w:pPr>
+        <w:ind w:left="360"/>
+        <w:shd w:fill="F0F0F0"/>
+      </w:pPr>
+      <w:r>
+        <w:rPr>
+          <w:rFonts w:ascii="Courier New" w:hAnsi="Courier New"/>
+          <w:color w:val="1A1A1A"/>
+          <w:sz w:val="19"/>
+        </w:rPr>
+        <w:t xml:space="preserve">    L::Float64 = 1.0</w:t>
+      </w:r>
+    </w:p>
+    <w:p>
+      <w:pPr>
+        <w:ind w:left="360"/>
+        <w:shd w:fill="F0F0F0"/>
+      </w:pPr>
+      <w:r>
+        <w:rPr>
+          <w:rFonts w:ascii="Courier New" w:hAnsi="Courier New"/>
+          <w:color w:val="1A1A1A"/>
+          <w:sz w:val="19"/>
+        </w:rPr>
+        <w:t xml:space="preserve">    T::Float64 = 1.5</w:t>
+      </w:r>
+    </w:p>
+    <w:p>
+      <w:pPr>
+        <w:ind w:left="360"/>
+        <w:shd w:fill="F0F0F0"/>
+      </w:pPr>
+      <w:r>
+        <w:rPr>
+          <w:rFonts w:ascii="Courier New" w:hAnsi="Courier New"/>
+          <w:color w:val="1A1A1A"/>
+          <w:sz w:val="19"/>
+        </w:rPr>
+        <w:t xml:space="preserve">    bc::Symbol = :Dirichlet  # :Dirichlet | :Neumann | :Periodic | :Absorbing</w:t>
+      </w:r>
+    </w:p>
+    <w:p>
+      <w:pPr>
+        <w:ind w:left="360"/>
+        <w:shd w:fill="F0F0F0"/>
+      </w:pPr>
+      <w:r>
+        <w:rPr>
+          <w:rFonts w:ascii="Courier New" w:hAnsi="Courier New"/>
+          <w:color w:val="1A1A1A"/>
+          <w:sz w:val="19"/>
+        </w:rPr>
+        <w:t xml:space="preserve">    f_init::Function = x -&gt; sin.(pi * x)</w:t>
+      </w:r>
+    </w:p>
+    <w:p>
+      <w:pPr>
+        <w:ind w:left="360"/>
+        <w:shd w:fill="F0F0F0"/>
+      </w:pPr>
+      <w:r>
+        <w:rPr>
+          <w:rFonts w:ascii="Courier New" w:hAnsi="Courier New"/>
+          <w:color w:val="1A1A1A"/>
+          <w:sz w:val="19"/>
+        </w:rPr>
+        <w:t xml:space="preserve">    dx::Float64 = L / (nx - 1)</w:t>
+      </w:r>
+    </w:p>
+    <w:p>
+      <w:pPr>
+        <w:ind w:left="360"/>
+        <w:shd w:fill="F0F0F0"/>
+      </w:pPr>
+      <w:r>
+        <w:rPr>
+          <w:rFonts w:ascii="Courier New" w:hAnsi="Courier New"/>
+          <w:color w:val="1A1A1A"/>
+          <w:sz w:val="19"/>
+        </w:rPr>
+        <w:t xml:space="preserve">    dt::Float64 = T / nt</w:t>
+      </w:r>
+    </w:p>
+    <w:p>
+      <w:pPr>
+        <w:ind w:left="360"/>
+        <w:shd w:fill="F0F0F0"/>
+      </w:pPr>
+      <w:r>
+        <w:rPr>
+          <w:rFonts w:ascii="Courier New" w:hAnsi="Courier New"/>
+          <w:color w:val="1A1A1A"/>
+          <w:sz w:val="19"/>
+        </w:rPr>
+        <w:t xml:space="preserve">    x::Any = range(0, L, length=nx)</w:t>
+      </w:r>
+    </w:p>
+    <w:p>
+      <w:pPr>
+        <w:ind w:left="360"/>
+        <w:shd w:fill="F0F0F0"/>
+      </w:pPr>
+      <w:r>
+        <w:rPr>
+          <w:rFonts w:ascii="Courier New" w:hAnsi="Courier New"/>
+          <w:color w:val="1A1A1A"/>
+          <w:sz w:val="19"/>
+        </w:rPr>
+        <w:t>end</w:t>
+      </w:r>
+    </w:p>
+    <w:p>
+      <w:r>
+        <w:rPr>
+          <w:rFonts w:ascii="Arial" w:hAnsi="Arial"/>
+          <w:b w:val="0"/>
+          <w:i w:val="0"/>
+          <w:sz w:val="22"/>
+        </w:rPr>
+        <w:t>The leap-frog update uses the same 3-point Laplacian stencil as the heat equation, but stepped in time with two history slots (u_prev, u_curr). CFL: λ = c·dt/dx ≤ 1.</w:t>
+      </w:r>
+    </w:p>
+    <w:p>
+      <w:pPr>
+        <w:ind w:left="360"/>
+        <w:shd w:fill="F0F0F0"/>
+      </w:pPr>
+      <w:r>
+        <w:rPr>
+          <w:rFonts w:ascii="Courier New" w:hAnsi="Courier New"/>
+          <w:color w:val="1A1A1A"/>
+          <w:sz w:val="19"/>
+        </w:rPr>
+        <w:t>function solve_wave_1d(problem::WaveEquation; return_history=false)</w:t>
+      </w:r>
+    </w:p>
+    <w:p>
+      <w:pPr>
+        <w:ind w:left="360"/>
+        <w:shd w:fill="F0F0F0"/>
+      </w:pPr>
+      <w:r>
+        <w:rPr>
+          <w:rFonts w:ascii="Courier New" w:hAnsi="Courier New"/>
+          <w:color w:val="1A1A1A"/>
+          <w:sz w:val="19"/>
+        </w:rPr>
+        <w:t xml:space="preserve">    dx, dt, x = problem.dx, problem.dt, problem.x</w:t>
+      </w:r>
+    </w:p>
+    <w:p>
+      <w:pPr>
+        <w:ind w:left="360"/>
+        <w:shd w:fill="F0F0F0"/>
+      </w:pPr>
+      <w:r>
+        <w:rPr>
+          <w:rFonts w:ascii="Courier New" w:hAnsi="Courier New"/>
+          <w:color w:val="1A1A1A"/>
+          <w:sz w:val="19"/>
+        </w:rPr>
+        <w:t xml:space="preserve">    λ = (problem.c * dt / dx)^2</w:t>
+      </w:r>
+    </w:p>
+    <w:p>
+      <w:pPr>
+        <w:ind w:left="360"/>
+        <w:shd w:fill="F0F0F0"/>
+      </w:pPr>
+      <w:r>
+        <w:rPr>
+          <w:rFonts w:ascii="Courier New" w:hAnsi="Courier New"/>
+          <w:color w:val="1A1A1A"/>
+          <w:sz w:val="19"/>
+        </w:rPr>
+        <w:t xml:space="preserve">    u_curr = problem.f_init.(x)</w:t>
+      </w:r>
+    </w:p>
+    <w:p>
+      <w:pPr>
+        <w:ind w:left="360"/>
+        <w:shd w:fill="F0F0F0"/>
+      </w:pPr>
+      <w:r>
+        <w:rPr>
+          <w:rFonts w:ascii="Courier New" w:hAnsi="Courier New"/>
+          <w:color w:val="1A1A1A"/>
+          <w:sz w:val="19"/>
+        </w:rPr>
+        <w:t xml:space="preserve">    apply_boundary_conditions!(u_curr, u_curr, problem; is_initial=true)</w:t>
+      </w:r>
+    </w:p>
+    <w:p>
+      <w:pPr>
+        <w:ind w:left="360"/>
+        <w:shd w:fill="F0F0F0"/>
+      </w:pPr>
+      <w:r>
+        <w:rPr>
+          <w:rFonts w:ascii="Courier New" w:hAnsi="Courier New"/>
+          <w:color w:val="1A1A1A"/>
+          <w:sz w:val="19"/>
+        </w:rPr>
+        <w:t xml:space="preserve">    u_prev = copy(u_curr); u_next = copy(u_curr)</w:t>
+      </w:r>
+    </w:p>
+    <w:p>
+      <w:pPr>
+        <w:ind w:left="360"/>
+        <w:shd w:fill="F0F0F0"/>
+      </w:pPr>
+      <w:r>
+        <w:rPr>
+          <w:rFonts w:ascii="Courier New" w:hAnsi="Courier New"/>
+          <w:color w:val="1A1A1A"/>
+          <w:sz w:val="19"/>
+        </w:rPr>
+        <w:t xml:space="preserve">    for i in 1:problem.nt</w:t>
+      </w:r>
+    </w:p>
+    <w:p>
+      <w:pPr>
+        <w:ind w:left="360"/>
+        <w:shd w:fill="F0F0F0"/>
+      </w:pPr>
+      <w:r>
+        <w:rPr>
+          <w:rFonts w:ascii="Courier New" w:hAnsi="Courier New"/>
+          <w:color w:val="1A1A1A"/>
+          <w:sz w:val="19"/>
+        </w:rPr>
+        <w:t xml:space="preserve">        # Leap-frog: u^{n+1} = 2u^n - u^{n-1} + λ²·(stencil)</w:t>
+      </w:r>
+    </w:p>
+    <w:p>
+      <w:pPr>
+        <w:ind w:left="360"/>
+        <w:shd w:fill="F0F0F0"/>
+      </w:pPr>
+      <w:r>
+        <w:rPr>
+          <w:rFonts w:ascii="Courier New" w:hAnsi="Courier New"/>
+          <w:color w:val="1A1A1A"/>
+          <w:sz w:val="19"/>
+        </w:rPr>
+        <w:t xml:space="preserve">        u_next[2:end-1] .= 2 .* u_curr[2:end-1] .- u_prev[2:end-1] .+</w:t>
+      </w:r>
+    </w:p>
+    <w:p>
+      <w:pPr>
+        <w:ind w:left="360"/>
+        <w:shd w:fill="F0F0F0"/>
+      </w:pPr>
+      <w:r>
+        <w:rPr>
+          <w:rFonts w:ascii="Courier New" w:hAnsi="Courier New"/>
+          <w:color w:val="1A1A1A"/>
+          <w:sz w:val="19"/>
+        </w:rPr>
+        <w:t xml:space="preserve">            λ .* (u_curr[3:end] .- 2 .* u_curr[2:end-1] .+ u_curr[1:end-2])</w:t>
+      </w:r>
+    </w:p>
+    <w:p>
+      <w:pPr>
+        <w:ind w:left="360"/>
+        <w:shd w:fill="F0F0F0"/>
+      </w:pPr>
+      <w:r>
+        <w:rPr>
+          <w:rFonts w:ascii="Courier New" w:hAnsi="Courier New"/>
+          <w:color w:val="1A1A1A"/>
+          <w:sz w:val="19"/>
+        </w:rPr>
+        <w:t xml:space="preserve">        apply_boundary_conditions!(u_next, u_curr, problem)</w:t>
+      </w:r>
+    </w:p>
+    <w:p>
+      <w:pPr>
+        <w:ind w:left="360"/>
+        <w:shd w:fill="F0F0F0"/>
+      </w:pPr>
+      <w:r>
+        <w:rPr>
+          <w:rFonts w:ascii="Courier New" w:hAnsi="Courier New"/>
+          <w:color w:val="1A1A1A"/>
+          <w:sz w:val="19"/>
+        </w:rPr>
+        <w:t xml:space="preserve">        u_prev, u_curr = copy(u_curr), copy(u_next)</w:t>
+      </w:r>
+    </w:p>
+    <w:p>
+      <w:pPr>
+        <w:ind w:left="360"/>
+        <w:shd w:fill="F0F0F0"/>
+      </w:pPr>
+      <w:r>
+        <w:rPr>
+          <w:rFonts w:ascii="Courier New" w:hAnsi="Courier New"/>
+          <w:color w:val="1A1A1A"/>
+          <w:sz w:val="19"/>
+        </w:rPr>
+        <w:t xml:space="preserve">    end</w:t>
+      </w:r>
+    </w:p>
+    <w:p>
+      <w:pPr>
+        <w:ind w:left="360"/>
+        <w:shd w:fill="F0F0F0"/>
+      </w:pPr>
+      <w:r>
+        <w:rPr>
+          <w:rFonts w:ascii="Courier New" w:hAnsi="Courier New"/>
+          <w:color w:val="1A1A1A"/>
+          <w:sz w:val="19"/>
+        </w:rPr>
+        <w:t xml:space="preserve">    return collect(x), u_curr</w:t>
+      </w:r>
+    </w:p>
+    <w:p>
+      <w:pPr>
+        <w:ind w:left="360"/>
+        <w:shd w:fill="F0F0F0"/>
+      </w:pPr>
+      <w:r>
+        <w:rPr>
+          <w:rFonts w:ascii="Courier New" w:hAnsi="Courier New"/>
+          <w:color w:val="1A1A1A"/>
+          <w:sz w:val="19"/>
+        </w:rPr>
+        <w:t>end</w:t>
+      </w:r>
+    </w:p>
+    <w:p>
+      <w:r>
+        <w:rPr>
+          <w:rFonts w:ascii="Arial" w:hAnsi="Arial"/>
+          <w:b w:val="0"/>
+          <w:i w:val="0"/>
+          <w:sz w:val="22"/>
+        </w:rPr>
+        <w:t>The full file also defines apply_boundary_conditions! (one branch per BC symbol), animate_wave_1d (saves a GIF), and an analytic wave_1d_exact reference solution — see juliaPDEs/src/wave.jl in the repo for the complete code.</w:t>
+      </w:r>
+    </w:p>
+    <w:p>
+      <w:r>
+        <w:br w:type="page"/>
+      </w:r>
+    </w:p>
+    <w:p>
+      <w:pPr>
+        <w:pStyle w:val="Heading2"/>
+      </w:pPr>
+      <w:r>
+        <w:rPr>
+          <w:rFonts w:ascii="Arial" w:hAnsi="Arial"/>
+          <w:b/>
+          <w:color w:val="2E75B6"/>
+          <w:sz w:val="28"/>
+        </w:rPr>
+        <w:t>4.5.6  Step F — The Navier-Stokes solver: src/Navier_Stokes.jl</w:t>
+      </w:r>
+    </w:p>
+    <w:p>
+      <w:r>
+        <w:rPr>
+          <w:rFonts w:ascii="Arial" w:hAnsi="Arial"/>
+          <w:b w:val="0"/>
+          <w:i w:val="0"/>
+          <w:sz w:val="22"/>
+        </w:rPr>
+        <w:t>The incompressible Navier-Stokes equations are two coupled PDEs in the velocity field u(x,y,t) = (u, v) and the pressure p(x,y,t):</w:t>
+      </w:r>
+    </w:p>
+    <w:p>
+      <w:pPr>
+        <w:ind w:left="360"/>
+        <w:shd w:fill="F0F0F0"/>
+      </w:pPr>
+      <w:r>
+        <w:rPr>
+          <w:rFonts w:ascii="Courier New" w:hAnsi="Courier New"/>
+          <w:color w:val="1A1A1A"/>
+          <w:sz w:val="19"/>
+        </w:rPr>
+        <w:t>∂u/∂t + (u · ∇)u = -∇p + ν·∇²u        # momentum</w:t>
+      </w:r>
+    </w:p>
+    <w:p>
+      <w:pPr>
+        <w:ind w:left="360"/>
+        <w:shd w:fill="F0F0F0"/>
+      </w:pPr>
+      <w:r>
+        <w:rPr>
+          <w:rFonts w:ascii="Courier New" w:hAnsi="Courier New"/>
+          <w:color w:val="1A1A1A"/>
+          <w:sz w:val="19"/>
+        </w:rPr>
+        <w:t xml:space="preserve">             ∇ · u = 0                # incompressibility</w:t>
+      </w:r>
+    </w:p>
+    <w:p>
+      <w:r>
+        <w:rPr>
+          <w:rFonts w:ascii="Arial" w:hAnsi="Arial"/>
+          <w:b w:val="0"/>
+          <w:i w:val="0"/>
+          <w:sz w:val="22"/>
+        </w:rPr>
+        <w:t>Each term has a physical meaning: (u·∇)u is advection (fluid carrying its own momentum — the nonlinear part), -∇p is the pressure gradient that enforces incompressibility, ν·∇²u is viscous diffusion, and ∇·u = 0 keeps the flow divergence-free at every step.</w:t>
+      </w:r>
+    </w:p>
+    <w:p>
+      <w:r>
+        <w:rPr>
+          <w:rFonts w:ascii="Arial" w:hAnsi="Arial"/>
+          <w:b w:val="0"/>
+          <w:i w:val="0"/>
+          <w:sz w:val="22"/>
+        </w:rPr>
+        <w:t>We solve the classic lid-driven cavity benchmark on Ω = [0,1]×[0,1]:</w:t>
+      </w:r>
+    </w:p>
+    <w:p>
+      <w:pPr>
+        <w:pStyle w:val="ListBullet"/>
+      </w:pPr>
+      <w:r>
+        <w:rPr>
+          <w:rFonts w:ascii="Arial" w:hAnsi="Arial"/>
+          <w:sz w:val="22"/>
+        </w:rPr>
+        <w:t>Top lid (north):  u = 1, v = 0 — drives the flow.</w:t>
+      </w:r>
+    </w:p>
+    <w:p>
+      <w:pPr>
+        <w:pStyle w:val="ListBullet"/>
+      </w:pPr>
+      <w:r>
+        <w:rPr>
+          <w:rFonts w:ascii="Arial" w:hAnsi="Arial"/>
+          <w:sz w:val="22"/>
+        </w:rPr>
+        <w:t>Other walls:      u = v = 0 (no-slip) — the default.</w:t>
+      </w:r>
+    </w:p>
+    <w:p>
+      <w:pPr>
+        <w:pStyle w:val="ListBullet"/>
+      </w:pPr>
+      <w:r>
+        <w:rPr>
+          <w:rFonts w:ascii="Arial" w:hAnsi="Arial"/>
+          <w:sz w:val="22"/>
+        </w:rPr>
+        <w:t>Initial condition: u(x,y,0) = 0.</w:t>
+      </w:r>
+    </w:p>
+    <w:p>
+      <w:pPr>
+        <w:pStyle w:val="ListBullet"/>
+      </w:pPr>
+      <w:r>
+        <w:rPr>
+          <w:rFonts w:ascii="Arial" w:hAnsi="Arial"/>
+          <w:sz w:val="22"/>
+        </w:rPr>
+        <w:t>Reynolds number:  Re = U·L / ν = (1·1)/0.01 = 100, set by choosing ν = 1e-2 in ScalarDiffusivity.</w:t>
+      </w:r>
+    </w:p>
+    <w:p>
+      <w:r>
+        <w:rPr>
+          <w:rFonts w:ascii="Arial" w:hAnsi="Arial"/>
+          <w:b w:val="0"/>
+          <w:i w:val="0"/>
+          <w:sz w:val="22"/>
+        </w:rPr>
+        <w:t>Rather than discretising and writing a projection method by hand, we delegate to Oceananigans.jl. Oceananigans handles the staggered finite-volume grid, a 5th-order upwind-biased advection scheme, the divergence-free pressure projection, and a 3rd-order Runge-Kutta time integrator — all on CPU or GPU. The simulation runs for t ∈ [0, 10] with Δt = 1e-3 and pushes a snapshot of the speed field √(u² + v²) into speed_hist every 100 iterations so we can animate it later with animate_navier_stokes:</w:t>
+      </w:r>
+    </w:p>
+    <w:p>
+      <w:pPr>
+        <w:ind w:left="360"/>
+        <w:shd w:fill="F0F0F0"/>
+      </w:pPr>
+      <w:r>
+        <w:rPr>
+          <w:rFonts w:ascii="Courier New" w:hAnsi="Courier New"/>
+          <w:color w:val="1A1A1A"/>
+          <w:sz w:val="19"/>
+        </w:rPr>
+        <w:t>function solve_navier_stokes()</w:t>
+      </w:r>
+    </w:p>
+    <w:p>
+      <w:pPr>
+        <w:ind w:left="360"/>
+        <w:shd w:fill="F0F0F0"/>
+      </w:pPr>
+      <w:r>
+        <w:rPr>
+          <w:rFonts w:ascii="Courier New" w:hAnsi="Courier New"/>
+          <w:color w:val="1A1A1A"/>
+          <w:sz w:val="19"/>
+        </w:rPr>
+        <w:t xml:space="preserve">    grid = Oceananigans.RectilinearGrid(size=(64, 64),</w:t>
+      </w:r>
+    </w:p>
+    <w:p>
+      <w:pPr>
+        <w:ind w:left="360"/>
+        <w:shd w:fill="F0F0F0"/>
+      </w:pPr>
+      <w:r>
+        <w:rPr>
+          <w:rFonts w:ascii="Courier New" w:hAnsi="Courier New"/>
+          <w:color w:val="1A1A1A"/>
+          <w:sz w:val="19"/>
+        </w:rPr>
+        <w:t xml:space="preserve">        x=(0, 1), y=(0, 1), topology=(Bounded, Bounded, Flat))</w:t>
+      </w:r>
+    </w:p>
+    <w:p>
+      <w:pPr>
+        <w:ind w:left="360"/>
+        <w:shd w:fill="F0F0F0"/>
+      </w:pPr>
+      <w:r>
+        <w:rPr>
+          <w:rFonts w:ascii="Courier New" w:hAnsi="Courier New"/>
+          <w:color w:val="1A1A1A"/>
+          <w:sz w:val="19"/>
+        </w:rPr>
+      </w:r>
+    </w:p>
+    <w:p>
+      <w:pPr>
+        <w:ind w:left="360"/>
+        <w:shd w:fill="F0F0F0"/>
+      </w:pPr>
+      <w:r>
+        <w:rPr>
+          <w:rFonts w:ascii="Courier New" w:hAnsi="Courier New"/>
+          <w:color w:val="1A1A1A"/>
+          <w:sz w:val="19"/>
+        </w:rPr>
+        <w:t xml:space="preserve">    # Top lid moves at speed 1</w:t>
+      </w:r>
+    </w:p>
+    <w:p>
+      <w:pPr>
+        <w:ind w:left="360"/>
+        <w:shd w:fill="F0F0F0"/>
+      </w:pPr>
+      <w:r>
+        <w:rPr>
+          <w:rFonts w:ascii="Courier New" w:hAnsi="Courier New"/>
+          <w:color w:val="1A1A1A"/>
+          <w:sz w:val="19"/>
+        </w:rPr>
+        <w:t xml:space="preserve">    u_bcs = Oceananigans.FieldBoundaryConditions(</w:t>
+      </w:r>
+    </w:p>
+    <w:p>
+      <w:pPr>
+        <w:ind w:left="360"/>
+        <w:shd w:fill="F0F0F0"/>
+      </w:pPr>
+      <w:r>
+        <w:rPr>
+          <w:rFonts w:ascii="Courier New" w:hAnsi="Courier New"/>
+          <w:color w:val="1A1A1A"/>
+          <w:sz w:val="19"/>
+        </w:rPr>
+        <w:t xml:space="preserve">        north = Oceananigans.ValueBoundaryCondition(1.0))</w:t>
+      </w:r>
+    </w:p>
+    <w:p>
+      <w:pPr>
+        <w:ind w:left="360"/>
+        <w:shd w:fill="F0F0F0"/>
+      </w:pPr>
+      <w:r>
+        <w:rPr>
+          <w:rFonts w:ascii="Courier New" w:hAnsi="Courier New"/>
+          <w:color w:val="1A1A1A"/>
+          <w:sz w:val="19"/>
+        </w:rPr>
+      </w:r>
+    </w:p>
+    <w:p>
+      <w:pPr>
+        <w:ind w:left="360"/>
+        <w:shd w:fill="F0F0F0"/>
+      </w:pPr>
+      <w:r>
+        <w:rPr>
+          <w:rFonts w:ascii="Courier New" w:hAnsi="Courier New"/>
+          <w:color w:val="1A1A1A"/>
+          <w:sz w:val="19"/>
+        </w:rPr>
+        <w:t xml:space="preserve">    model = Oceananigans.NonhydrostaticModel(grid;</w:t>
+      </w:r>
+    </w:p>
+    <w:p>
+      <w:pPr>
+        <w:ind w:left="360"/>
+        <w:shd w:fill="F0F0F0"/>
+      </w:pPr>
+      <w:r>
+        <w:rPr>
+          <w:rFonts w:ascii="Courier New" w:hAnsi="Courier New"/>
+          <w:color w:val="1A1A1A"/>
+          <w:sz w:val="19"/>
+        </w:rPr>
+        <w:t xml:space="preserve">        advection   = Oceananigans.UpwindBiased(order=5),</w:t>
+      </w:r>
+    </w:p>
+    <w:p>
+      <w:pPr>
+        <w:ind w:left="360"/>
+        <w:shd w:fill="F0F0F0"/>
+      </w:pPr>
+      <w:r>
+        <w:rPr>
+          <w:rFonts w:ascii="Courier New" w:hAnsi="Courier New"/>
+          <w:color w:val="1A1A1A"/>
+          <w:sz w:val="19"/>
+        </w:rPr>
+        <w:t xml:space="preserve">        timestepper = :RungeKutta3,</w:t>
+      </w:r>
+    </w:p>
+    <w:p>
+      <w:pPr>
+        <w:ind w:left="360"/>
+        <w:shd w:fill="F0F0F0"/>
+      </w:pPr>
+      <w:r>
+        <w:rPr>
+          <w:rFonts w:ascii="Courier New" w:hAnsi="Courier New"/>
+          <w:color w:val="1A1A1A"/>
+          <w:sz w:val="19"/>
+        </w:rPr>
+        <w:t xml:space="preserve">        boundary_conditions = (u=u_bcs,),</w:t>
+      </w:r>
+    </w:p>
+    <w:p>
+      <w:pPr>
+        <w:ind w:left="360"/>
+        <w:shd w:fill="F0F0F0"/>
+      </w:pPr>
+      <w:r>
+        <w:rPr>
+          <w:rFonts w:ascii="Courier New" w:hAnsi="Courier New"/>
+          <w:color w:val="1A1A1A"/>
+          <w:sz w:val="19"/>
+        </w:rPr>
+        <w:t xml:space="preserve">        closure     = Oceananigans.ScalarDiffusivity(ν=1e-2))   # ν = 1/Re</w:t>
+      </w:r>
+    </w:p>
+    <w:p>
+      <w:pPr>
+        <w:ind w:left="360"/>
+        <w:shd w:fill="F0F0F0"/>
+      </w:pPr>
+      <w:r>
+        <w:rPr>
+          <w:rFonts w:ascii="Courier New" w:hAnsi="Courier New"/>
+          <w:color w:val="1A1A1A"/>
+          <w:sz w:val="19"/>
+        </w:rPr>
+      </w:r>
+    </w:p>
+    <w:p>
+      <w:pPr>
+        <w:ind w:left="360"/>
+        <w:shd w:fill="F0F0F0"/>
+      </w:pPr>
+      <w:r>
+        <w:rPr>
+          <w:rFonts w:ascii="Courier New" w:hAnsi="Courier New"/>
+          <w:color w:val="1A1A1A"/>
+          <w:sz w:val="19"/>
+        </w:rPr>
+        <w:t xml:space="preserve">    Oceananigans.set!(model, u=0, v=0)</w:t>
+      </w:r>
+    </w:p>
+    <w:p>
+      <w:pPr>
+        <w:ind w:left="360"/>
+        <w:shd w:fill="F0F0F0"/>
+      </w:pPr>
+      <w:r>
+        <w:rPr>
+          <w:rFonts w:ascii="Courier New" w:hAnsi="Courier New"/>
+          <w:color w:val="1A1A1A"/>
+          <w:sz w:val="19"/>
+        </w:rPr>
+        <w:t xml:space="preserve">    simulation = Oceananigans.Simulation(model, Δt=1e-3, stop_time=10.0)</w:t>
+      </w:r>
+    </w:p>
+    <w:p>
+      <w:pPr>
+        <w:ind w:left="360"/>
+        <w:shd w:fill="F0F0F0"/>
+      </w:pPr>
+      <w:r>
+        <w:rPr>
+          <w:rFonts w:ascii="Courier New" w:hAnsi="Courier New"/>
+          <w:color w:val="1A1A1A"/>
+          <w:sz w:val="19"/>
+        </w:rPr>
+      </w:r>
+    </w:p>
+    <w:p>
+      <w:pPr>
+        <w:ind w:left="360"/>
+        <w:shd w:fill="F0F0F0"/>
+      </w:pPr>
+      <w:r>
+        <w:rPr>
+          <w:rFonts w:ascii="Courier New" w:hAnsi="Courier New"/>
+          <w:color w:val="1A1A1A"/>
+          <w:sz w:val="19"/>
+        </w:rPr>
+        <w:t xml:space="preserve">    speed_field = Oceananigans.Field(</w:t>
+      </w:r>
+    </w:p>
+    <w:p>
+      <w:pPr>
+        <w:ind w:left="360"/>
+        <w:shd w:fill="F0F0F0"/>
+      </w:pPr>
+      <w:r>
+        <w:rPr>
+          <w:rFonts w:ascii="Courier New" w:hAnsi="Courier New"/>
+          <w:color w:val="1A1A1A"/>
+          <w:sz w:val="19"/>
+        </w:rPr>
+        <w:t xml:space="preserve">        sqrt(model.velocities.u^2 + model.velocities.v^2))</w:t>
+      </w:r>
+    </w:p>
+    <w:p>
+      <w:pPr>
+        <w:ind w:left="360"/>
+        <w:shd w:fill="F0F0F0"/>
+      </w:pPr>
+      <w:r>
+        <w:rPr>
+          <w:rFonts w:ascii="Courier New" w:hAnsi="Courier New"/>
+          <w:color w:val="1A1A1A"/>
+          <w:sz w:val="19"/>
+        </w:rPr>
+        <w:t xml:space="preserve">    speed_hist  = []</w:t>
+      </w:r>
+    </w:p>
+    <w:p>
+      <w:pPr>
+        <w:ind w:left="360"/>
+        <w:shd w:fill="F0F0F0"/>
+      </w:pPr>
+      <w:r>
+        <w:rPr>
+          <w:rFonts w:ascii="Courier New" w:hAnsi="Courier New"/>
+          <w:color w:val="1A1A1A"/>
+          <w:sz w:val="19"/>
+        </w:rPr>
+      </w:r>
+    </w:p>
+    <w:p>
+      <w:pPr>
+        <w:ind w:left="360"/>
+        <w:shd w:fill="F0F0F0"/>
+      </w:pPr>
+      <w:r>
+        <w:rPr>
+          <w:rFonts w:ascii="Courier New" w:hAnsi="Courier New"/>
+          <w:color w:val="1A1A1A"/>
+          <w:sz w:val="19"/>
+        </w:rPr>
+        <w:t xml:space="preserve">    function save_state(sim)</w:t>
+      </w:r>
+    </w:p>
+    <w:p>
+      <w:pPr>
+        <w:ind w:left="360"/>
+        <w:shd w:fill="F0F0F0"/>
+      </w:pPr>
+      <w:r>
+        <w:rPr>
+          <w:rFonts w:ascii="Courier New" w:hAnsi="Courier New"/>
+          <w:color w:val="1A1A1A"/>
+          <w:sz w:val="19"/>
+        </w:rPr>
+        <w:t xml:space="preserve">        Oceananigans.compute!(speed_field)</w:t>
+      </w:r>
+    </w:p>
+    <w:p>
+      <w:pPr>
+        <w:ind w:left="360"/>
+        <w:shd w:fill="F0F0F0"/>
+      </w:pPr>
+      <w:r>
+        <w:rPr>
+          <w:rFonts w:ascii="Courier New" w:hAnsi="Courier New"/>
+          <w:color w:val="1A1A1A"/>
+          <w:sz w:val="19"/>
+        </w:rPr>
+        <w:t xml:space="preserve">        push!(speed_hist, copy(Oceananigans.interior(speed_field, :, :, 1)))</w:t>
+      </w:r>
+    </w:p>
+    <w:p>
+      <w:pPr>
+        <w:ind w:left="360"/>
+        <w:shd w:fill="F0F0F0"/>
+      </w:pPr>
+      <w:r>
+        <w:rPr>
+          <w:rFonts w:ascii="Courier New" w:hAnsi="Courier New"/>
+          <w:color w:val="1A1A1A"/>
+          <w:sz w:val="19"/>
+        </w:rPr>
+        <w:t xml:space="preserve">    end</w:t>
+      </w:r>
+    </w:p>
+    <w:p>
+      <w:pPr>
+        <w:ind w:left="360"/>
+        <w:shd w:fill="F0F0F0"/>
+      </w:pPr>
+      <w:r>
+        <w:rPr>
+          <w:rFonts w:ascii="Courier New" w:hAnsi="Courier New"/>
+          <w:color w:val="1A1A1A"/>
+          <w:sz w:val="19"/>
+        </w:rPr>
+        <w:t xml:space="preserve">    simulation.callbacks[:save] = Oceananigans.Callback(</w:t>
+      </w:r>
+    </w:p>
+    <w:p>
+      <w:pPr>
+        <w:ind w:left="360"/>
+        <w:shd w:fill="F0F0F0"/>
+      </w:pPr>
+      <w:r>
+        <w:rPr>
+          <w:rFonts w:ascii="Courier New" w:hAnsi="Courier New"/>
+          <w:color w:val="1A1A1A"/>
+          <w:sz w:val="19"/>
+        </w:rPr>
+        <w:t xml:space="preserve">        save_state, Oceananigans.IterationInterval(100))</w:t>
+      </w:r>
+    </w:p>
+    <w:p>
+      <w:pPr>
+        <w:ind w:left="360"/>
+        <w:shd w:fill="F0F0F0"/>
+      </w:pPr>
+      <w:r>
+        <w:rPr>
+          <w:rFonts w:ascii="Courier New" w:hAnsi="Courier New"/>
+          <w:color w:val="1A1A1A"/>
+          <w:sz w:val="19"/>
+        </w:rPr>
+      </w:r>
+    </w:p>
+    <w:p>
+      <w:pPr>
+        <w:ind w:left="360"/>
+        <w:shd w:fill="F0F0F0"/>
+      </w:pPr>
+      <w:r>
+        <w:rPr>
+          <w:rFonts w:ascii="Courier New" w:hAnsi="Courier New"/>
+          <w:color w:val="1A1A1A"/>
+          <w:sz w:val="19"/>
+        </w:rPr>
+        <w:t xml:space="preserve">    Oceananigans.run!(simulation)</w:t>
+      </w:r>
+    </w:p>
+    <w:p>
+      <w:pPr>
+        <w:ind w:left="360"/>
+        <w:shd w:fill="F0F0F0"/>
+      </w:pPr>
+      <w:r>
+        <w:rPr>
+          <w:rFonts w:ascii="Courier New" w:hAnsi="Courier New"/>
+          <w:color w:val="1A1A1A"/>
+          <w:sz w:val="19"/>
+        </w:rPr>
+        <w:t xml:space="preserve">    return (speed_hist=speed_hist, Δt=0.1)</w:t>
+      </w:r>
+    </w:p>
+    <w:p>
+      <w:pPr>
+        <w:ind w:left="360"/>
+        <w:shd w:fill="F0F0F0"/>
+      </w:pPr>
+      <w:r>
+        <w:rPr>
+          <w:rFonts w:ascii="Courier New" w:hAnsi="Courier New"/>
+          <w:color w:val="1A1A1A"/>
+          <w:sz w:val="19"/>
+        </w:rPr>
+        <w:t>end</w:t>
+      </w:r>
+    </w:p>
+    <w:p>
+      <w:r>
+        <w:br w:type="page"/>
+      </w:r>
+    </w:p>
+    <w:p>
+      <w:pPr>
+        <w:pStyle w:val="Heading2"/>
+      </w:pPr>
+      <w:r>
+        <w:rPr>
+          <w:rFonts w:ascii="Arial" w:hAnsi="Arial"/>
+          <w:b/>
+          <w:color w:val="2E75B6"/>
+          <w:sz w:val="28"/>
+        </w:rPr>
+        <w:t>4.5.7  Step G — Load the package &amp; run it</w:t>
+      </w:r>
+    </w:p>
+    <w:p>
+      <w:r>
+        <w:rPr>
+          <w:rFonts w:ascii="Arial" w:hAnsi="Arial"/>
+          <w:b w:val="0"/>
+          <w:i w:val="0"/>
+          <w:sz w:val="22"/>
+        </w:rPr>
+        <w:t>Pkg.develop links the package into your environment by path — no install, no version pin. Edits to src/ files take effect immediately (with Revise, see 4.5.9):</w:t>
+      </w:r>
+    </w:p>
+    <w:p>
+      <w:pPr>
+        <w:ind w:left="360"/>
+        <w:shd w:fill="F0F0F0"/>
+      </w:pPr>
+      <w:r>
+        <w:rPr>
+          <w:rFonts w:ascii="Courier New" w:hAnsi="Courier New"/>
+          <w:color w:val="1A1A1A"/>
+          <w:sz w:val="19"/>
+        </w:rPr>
+        <w:t># From the directory that CONTAINS the juliaPDEs/ folder:</w:t>
+      </w:r>
+    </w:p>
+    <w:p>
+      <w:pPr>
+        <w:ind w:left="360"/>
+        <w:shd w:fill="F0F0F0"/>
+      </w:pPr>
+      <w:r>
+        <w:rPr>
+          <w:rFonts w:ascii="Courier New" w:hAnsi="Courier New"/>
+          <w:color w:val="1A1A1A"/>
+          <w:sz w:val="19"/>
+        </w:rPr>
+        <w:t>using Pkg</w:t>
+      </w:r>
+    </w:p>
+    <w:p>
+      <w:pPr>
+        <w:ind w:left="360"/>
+        <w:shd w:fill="F0F0F0"/>
+      </w:pPr>
+      <w:r>
+        <w:rPr>
+          <w:rFonts w:ascii="Courier New" w:hAnsi="Courier New"/>
+          <w:color w:val="1A1A1A"/>
+          <w:sz w:val="19"/>
+        </w:rPr>
+        <w:t>Pkg.develop(path="./juliaPDEs")</w:t>
+      </w:r>
+    </w:p>
+    <w:p>
+      <w:pPr>
+        <w:ind w:left="360"/>
+        <w:shd w:fill="F0F0F0"/>
+      </w:pPr>
+      <w:r>
+        <w:rPr>
+          <w:rFonts w:ascii="Courier New" w:hAnsi="Courier New"/>
+          <w:color w:val="1A1A1A"/>
+          <w:sz w:val="19"/>
+        </w:rPr>
+      </w:r>
+    </w:p>
+    <w:p>
+      <w:pPr>
+        <w:ind w:left="360"/>
+        <w:shd w:fill="F0F0F0"/>
+      </w:pPr>
+      <w:r>
+        <w:rPr>
+          <w:rFonts w:ascii="Courier New" w:hAnsi="Courier New"/>
+          <w:color w:val="1A1A1A"/>
+          <w:sz w:val="19"/>
+        </w:rPr>
+        <w:t>using juliaPDEs</w:t>
+      </w:r>
+    </w:p>
+    <w:p>
+      <w:pPr>
+        <w:ind w:left="360"/>
+        <w:shd w:fill="F0F0F0"/>
+      </w:pPr>
+      <w:r>
+        <w:rPr>
+          <w:rFonts w:ascii="Courier New" w:hAnsi="Courier New"/>
+          <w:color w:val="1A1A1A"/>
+          <w:sz w:val="19"/>
+        </w:rPr>
+        <w:t>x, u  = solve_heat_1d()                            # heat</w:t>
+      </w:r>
+    </w:p>
+    <w:p>
+      <w:pPr>
+        <w:ind w:left="360"/>
+        <w:shd w:fill="F0F0F0"/>
+      </w:pPr>
+      <w:r>
+        <w:rPr>
+          <w:rFonts w:ascii="Courier New" w:hAnsi="Courier New"/>
+          <w:color w:val="1A1A1A"/>
+          <w:sz w:val="19"/>
+        </w:rPr>
+        <w:t>x, u  = solve_wave_1d(juliaPDEs.WaveEquation())    # wave (defaults)</w:t>
+      </w:r>
+    </w:p>
+    <w:p>
+      <w:pPr>
+        <w:ind w:left="360"/>
+        <w:shd w:fill="F0F0F0"/>
+      </w:pPr>
+      <w:r>
+        <w:rPr>
+          <w:rFonts w:ascii="Courier New" w:hAnsi="Courier New"/>
+          <w:color w:val="1A1A1A"/>
+          <w:sz w:val="19"/>
+        </w:rPr>
+        <w:t>hist  = solve_navier_stokes()                      # Navier-Stokes</w:t>
+      </w:r>
+    </w:p>
+    <w:p>
+      <w:pPr>
+        <w:ind w:left="360"/>
+        <w:shd w:fill="F0F0F0"/>
+      </w:pPr>
+      <w:r>
+        <w:rPr>
+          <w:rFonts w:ascii="Courier New" w:hAnsi="Courier New"/>
+          <w:color w:val="1A1A1A"/>
+          <w:sz w:val="19"/>
+        </w:rPr>
+        <w:t>animate_navier_stokes(hist)                        # → .gif</w:t>
+      </w:r>
+    </w:p>
+    <w:p>
+      <w:pPr>
+        <w:pStyle w:val="Heading2"/>
+      </w:pPr>
+      <w:r>
+        <w:rPr>
+          <w:rFonts w:ascii="Arial" w:hAnsi="Arial"/>
+          <w:b/>
+          <w:color w:val="2E75B6"/>
+          <w:sz w:val="28"/>
+        </w:rPr>
+        <w:t>4.5.8  Step H — Write tests</w:t>
+      </w:r>
+    </w:p>
+    <w:p>
+      <w:r>
+        <w:rPr>
+          <w:rFonts w:ascii="Arial" w:hAnsi="Arial"/>
+          <w:b w:val="0"/>
+          <w:i w:val="0"/>
+          <w:sz w:val="22"/>
+        </w:rPr>
+        <w:t>Tests live in test/runtests.jl. Run them with `(@juliaPDEs) pkg&gt; test`:</w:t>
+      </w:r>
+    </w:p>
+    <w:p>
+      <w:pPr>
+        <w:ind w:left="360"/>
+        <w:shd w:fill="F0F0F0"/>
+      </w:pPr>
+      <w:r>
+        <w:rPr>
+          <w:rFonts w:ascii="Courier New" w:hAnsi="Courier New"/>
+          <w:color w:val="1A1A1A"/>
+          <w:sz w:val="19"/>
+        </w:rPr>
+        <w:t>using juliaPDEs, Test</w:t>
+      </w:r>
+    </w:p>
+    <w:p>
+      <w:pPr>
+        <w:ind w:left="360"/>
+        <w:shd w:fill="F0F0F0"/>
+      </w:pPr>
+      <w:r>
+        <w:rPr>
+          <w:rFonts w:ascii="Courier New" w:hAnsi="Courier New"/>
+          <w:color w:val="1A1A1A"/>
+          <w:sz w:val="19"/>
+        </w:rPr>
+      </w:r>
+    </w:p>
+    <w:p>
+      <w:pPr>
+        <w:ind w:left="360"/>
+        <w:shd w:fill="F0F0F0"/>
+      </w:pPr>
+      <w:r>
+        <w:rPr>
+          <w:rFonts w:ascii="Courier New" w:hAnsi="Courier New"/>
+          <w:color w:val="1A1A1A"/>
+          <w:sz w:val="19"/>
+        </w:rPr>
+        <w:t>@testset "Heat equation" begin</w:t>
+      </w:r>
+    </w:p>
+    <w:p>
+      <w:pPr>
+        <w:ind w:left="360"/>
+        <w:shd w:fill="F0F0F0"/>
+      </w:pPr>
+      <w:r>
+        <w:rPr>
+          <w:rFonts w:ascii="Courier New" w:hAnsi="Courier New"/>
+          <w:color w:val="1A1A1A"/>
+          <w:sz w:val="19"/>
+        </w:rPr>
+        <w:t xml:space="preserve">    x, u = solve_heat_1d(N=50, T=0.1)</w:t>
+      </w:r>
+    </w:p>
+    <w:p>
+      <w:pPr>
+        <w:ind w:left="360"/>
+        <w:shd w:fill="F0F0F0"/>
+      </w:pPr>
+      <w:r>
+        <w:rPr>
+          <w:rFonts w:ascii="Courier New" w:hAnsi="Courier New"/>
+          <w:color w:val="1A1A1A"/>
+          <w:sz w:val="19"/>
+        </w:rPr>
+        <w:t xml:space="preserve">    @test length(x) == 50</w:t>
+      </w:r>
+    </w:p>
+    <w:p>
+      <w:pPr>
+        <w:ind w:left="360"/>
+        <w:shd w:fill="F0F0F0"/>
+      </w:pPr>
+      <w:r>
+        <w:rPr>
+          <w:rFonts w:ascii="Courier New" w:hAnsi="Courier New"/>
+          <w:color w:val="1A1A1A"/>
+          <w:sz w:val="19"/>
+        </w:rPr>
+        <w:t xml:space="preserve">    @test maximum(u) &lt; 1.0</w:t>
+      </w:r>
+    </w:p>
+    <w:p>
+      <w:pPr>
+        <w:ind w:left="360"/>
+        <w:shd w:fill="F0F0F0"/>
+      </w:pPr>
+      <w:r>
+        <w:rPr>
+          <w:rFonts w:ascii="Courier New" w:hAnsi="Courier New"/>
+          <w:color w:val="1A1A1A"/>
+          <w:sz w:val="19"/>
+        </w:rPr>
+        <w:t xml:space="preserve">    @test u[1]   ≈ 0.0 atol=1e-10</w:t>
+      </w:r>
+    </w:p>
+    <w:p>
+      <w:pPr>
+        <w:ind w:left="360"/>
+        <w:shd w:fill="F0F0F0"/>
+      </w:pPr>
+      <w:r>
+        <w:rPr>
+          <w:rFonts w:ascii="Courier New" w:hAnsi="Courier New"/>
+          <w:color w:val="1A1A1A"/>
+          <w:sz w:val="19"/>
+        </w:rPr>
+        <w:t xml:space="preserve">    @test u[end] ≈ 0.0 atol=1e-10</w:t>
+      </w:r>
+    </w:p>
+    <w:p>
+      <w:pPr>
+        <w:ind w:left="360"/>
+        <w:shd w:fill="F0F0F0"/>
+      </w:pPr>
+      <w:r>
+        <w:rPr>
+          <w:rFonts w:ascii="Courier New" w:hAnsi="Courier New"/>
+          <w:color w:val="1A1A1A"/>
+          <w:sz w:val="19"/>
+        </w:rPr>
+        <w:t>end</w:t>
+      </w:r>
+    </w:p>
+    <w:p>
+      <w:pPr>
+        <w:ind w:left="360"/>
+        <w:shd w:fill="F0F0F0"/>
+      </w:pPr>
+      <w:r>
+        <w:rPr>
+          <w:rFonts w:ascii="Courier New" w:hAnsi="Courier New"/>
+          <w:color w:val="1A1A1A"/>
+          <w:sz w:val="19"/>
+        </w:rPr>
+      </w:r>
+    </w:p>
+    <w:p>
+      <w:pPr>
+        <w:ind w:left="360"/>
+        <w:shd w:fill="F0F0F0"/>
+      </w:pPr>
+      <w:r>
+        <w:rPr>
+          <w:rFonts w:ascii="Courier New" w:hAnsi="Courier New"/>
+          <w:color w:val="1A1A1A"/>
+          <w:sz w:val="19"/>
+        </w:rPr>
+        <w:t>@testset "Wave equation" begin</w:t>
+      </w:r>
+    </w:p>
+    <w:p>
+      <w:pPr>
+        <w:ind w:left="360"/>
+        <w:shd w:fill="F0F0F0"/>
+      </w:pPr>
+      <w:r>
+        <w:rPr>
+          <w:rFonts w:ascii="Courier New" w:hAnsi="Courier New"/>
+          <w:color w:val="1A1A1A"/>
+          <w:sz w:val="19"/>
+        </w:rPr>
+        <w:t xml:space="preserve">    prob = juliaPDEs.WaveEquation(nx=100, nt=200, T=0.5)</w:t>
+      </w:r>
+    </w:p>
+    <w:p>
+      <w:pPr>
+        <w:ind w:left="360"/>
+        <w:shd w:fill="F0F0F0"/>
+      </w:pPr>
+      <w:r>
+        <w:rPr>
+          <w:rFonts w:ascii="Courier New" w:hAnsi="Courier New"/>
+          <w:color w:val="1A1A1A"/>
+          <w:sz w:val="19"/>
+        </w:rPr>
+        <w:t xml:space="preserve">    x, u = solve_wave_1d(prob)</w:t>
+      </w:r>
+    </w:p>
+    <w:p>
+      <w:pPr>
+        <w:ind w:left="360"/>
+        <w:shd w:fill="F0F0F0"/>
+      </w:pPr>
+      <w:r>
+        <w:rPr>
+          <w:rFonts w:ascii="Courier New" w:hAnsi="Courier New"/>
+          <w:color w:val="1A1A1A"/>
+          <w:sz w:val="19"/>
+        </w:rPr>
+        <w:t xml:space="preserve">    @test length(x) == 100</w:t>
+      </w:r>
+    </w:p>
+    <w:p>
+      <w:pPr>
+        <w:ind w:left="360"/>
+        <w:shd w:fill="F0F0F0"/>
+      </w:pPr>
+      <w:r>
+        <w:rPr>
+          <w:rFonts w:ascii="Courier New" w:hAnsi="Courier New"/>
+          <w:color w:val="1A1A1A"/>
+          <w:sz w:val="19"/>
+        </w:rPr>
+        <w:t xml:space="preserve">    @test all(isfinite, u)</w:t>
+      </w:r>
+    </w:p>
+    <w:p>
+      <w:pPr>
+        <w:ind w:left="360"/>
+        <w:shd w:fill="F0F0F0"/>
+      </w:pPr>
+      <w:r>
+        <w:rPr>
+          <w:rFonts w:ascii="Courier New" w:hAnsi="Courier New"/>
+          <w:color w:val="1A1A1A"/>
+          <w:sz w:val="19"/>
+        </w:rPr>
+        <w:t>end</w:t>
+      </w:r>
+    </w:p>
+    <w:p>
+      <w:pPr>
+        <w:pStyle w:val="Heading2"/>
+      </w:pPr>
+      <w:r>
+        <w:rPr>
+          <w:rFonts w:ascii="Arial" w:hAnsi="Arial"/>
+          <w:b/>
+          <w:color w:val="2E75B6"/>
+          <w:sz w:val="28"/>
+        </w:rPr>
+        <w:t>4.5.9  Revise — live reload during development</w:t>
+      </w:r>
+    </w:p>
+    <w:p>
+      <w:r>
+        <w:rPr>
+          <w:rFonts w:ascii="Arial" w:hAnsi="Arial"/>
+          <w:b w:val="0"/>
+          <w:i w:val="0"/>
+          <w:sz w:val="22"/>
+        </w:rPr>
+        <w:t>Add Revise to your global environment so changes to src/ files take effect without restarting Julia:</w:t>
+      </w:r>
+    </w:p>
+    <w:p>
+      <w:pPr>
+        <w:ind w:left="360"/>
+        <w:shd w:fill="F0F0F0"/>
+      </w:pPr>
+      <w:r>
+        <w:rPr>
+          <w:rFonts w:ascii="Courier New" w:hAnsi="Courier New"/>
+          <w:color w:val="1A1A1A"/>
+          <w:sz w:val="19"/>
+        </w:rPr>
+        <w:t>(@v1.10) pkg&gt; add Revise</w:t>
+      </w:r>
+    </w:p>
+    <w:p>
+      <w:r>
+        <w:rPr>
+          <w:rFonts w:ascii="Arial" w:hAnsi="Arial"/>
+          <w:b w:val="0"/>
+          <w:i w:val="0"/>
+          <w:sz w:val="22"/>
+        </w:rPr>
+        <w:t>Make Revise auto-load in every session by adding this to ~/.julia/config/startup.jl:</w:t>
+      </w:r>
+    </w:p>
+    <w:p>
+      <w:pPr>
+        <w:ind w:left="360"/>
+        <w:shd w:fill="F0F0F0"/>
+      </w:pPr>
+      <w:r>
+        <w:rPr>
+          <w:rFonts w:ascii="Courier New" w:hAnsi="Courier New"/>
+          <w:color w:val="1A1A1A"/>
+          <w:sz w:val="19"/>
+        </w:rPr>
+        <w:t>try</w:t>
+      </w:r>
+    </w:p>
+    <w:p>
+      <w:pPr>
+        <w:ind w:left="360"/>
+        <w:shd w:fill="F0F0F0"/>
+      </w:pPr>
+      <w:r>
+        <w:rPr>
+          <w:rFonts w:ascii="Courier New" w:hAnsi="Courier New"/>
+          <w:color w:val="1A1A1A"/>
+          <w:sz w:val="19"/>
+        </w:rPr>
+        <w:t xml:space="preserve">    using Revise</w:t>
+      </w:r>
+    </w:p>
+    <w:p>
+      <w:pPr>
+        <w:ind w:left="360"/>
+        <w:shd w:fill="F0F0F0"/>
+      </w:pPr>
+      <w:r>
+        <w:rPr>
+          <w:rFonts w:ascii="Courier New" w:hAnsi="Courier New"/>
+          <w:color w:val="1A1A1A"/>
+          <w:sz w:val="19"/>
+        </w:rPr>
+        <w:t>catch e</w:t>
+      </w:r>
+    </w:p>
+    <w:p>
+      <w:pPr>
+        <w:ind w:left="360"/>
+        <w:shd w:fill="F0F0F0"/>
+      </w:pPr>
+      <w:r>
+        <w:rPr>
+          <w:rFonts w:ascii="Courier New" w:hAnsi="Courier New"/>
+          <w:color w:val="1A1A1A"/>
+          <w:sz w:val="19"/>
+        </w:rPr>
+        <w:t xml:space="preserve">    @warn "Could not load Revise" exception = e</w:t>
+      </w:r>
+    </w:p>
+    <w:p>
+      <w:pPr>
+        <w:ind w:left="360"/>
+        <w:shd w:fill="F0F0F0"/>
+      </w:pPr>
+      <w:r>
+        <w:rPr>
+          <w:rFonts w:ascii="Courier New" w:hAnsi="Courier New"/>
+          <w:color w:val="1A1A1A"/>
+          <w:sz w:val="19"/>
+        </w:rPr>
+        <w:t>end</w:t>
+      </w:r>
+    </w:p>
+    <w:p>
+      <w:r>
+        <w:rPr>
+          <w:rFonts w:ascii="Arial" w:hAnsi="Arial"/>
+          <w:b w:val="0"/>
+          <w:i w:val="0"/>
+          <w:sz w:val="22"/>
+        </w:rPr>
+        <w:t>Then your day-to-day loop is: edit a src/*.jl file, save, call the function in the REPL — the new version runs immediately. Revise handles function bodies and module-level code; struct redefinitions and changes to top-level `using` still need a restart.</w:t>
+      </w:r>
+    </w:p>
+    <w:p>
+      <w:r>
+        <w:br w:type="page"/>
+      </w:r>
+    </w:p>
+    <w:p>
+      <w:pPr>
+        <w:pStyle w:val="Heading1"/>
+      </w:pPr>
+      <w:r>
+        <w:rPr>
+          <w:rFonts w:ascii="Arial" w:hAnsi="Arial"/>
+          <w:b/>
+          <w:color w:val="1F4E79"/>
+          <w:sz w:val="36"/>
+        </w:rPr>
         <w:t>Step 5 — The PDE Solving Workflow</w:t>
       </w:r>
     </w:p>
@@ -3995,7 +6189,7 @@
       <w:r>
         <w:drawing>
           <wp:inline xmlns:a="http://schemas.openxmlformats.org/drawingml/2006/main" xmlns:pic="http://schemas.openxmlformats.org/drawingml/2006/picture">
-            <wp:extent cx="5943600" cy="2917767"/>
+            <wp:extent cx="5943600" cy="3025833"/>
             <wp:docPr id="8" name="Picture 8"/>
             <wp:cNvGraphicFramePr>
               <a:graphicFrameLocks noChangeAspect="1"/>
@@ -4016,7 +6210,7 @@
                   <pic:spPr>
                     <a:xfrm>
                       <a:off x="0" y="0"/>
-                      <a:ext cx="5943600" cy="2917767"/>
+                      <a:ext cx="5943600" cy="3025833"/>
                     </a:xfrm>
                     <a:prstGeom prst="rect"/>
                   </pic:spPr>

</xml_diff>